<commit_message>
Upload via SKKN-AI: phu-luc-evidence_images.docx
</commit_message>
<xml_diff>
--- a/projects/skkn_1773776784610_eblasj47t/appendices/phu-luc-evidence_images.docx
+++ b/projects/skkn_1773776784610_eblasj47t/appendices/phu-luc-evidence_images.docx
@@ -1,53 +1,62 @@
 
-<file path=word/document.xml><?xml version="1.0" encoding="utf-8"?>
-<w:document xmlns:wpc="http://schemas.microsoft.com/office/word/2010/wordprocessingCanvas" xmlns:cx="http://schemas.microsoft.com/office/drawing/2014/chartex" xmlns:cx1="http://schemas.microsoft.com/office/drawing/2015/9/8/chartex" xmlns:cx2="http://schemas.microsoft.com/office/drawing/2015/10/21/chartex" xmlns:cx3="http://schemas.microsoft.com/office/drawing/2016/5/9/chartex" xmlns:cx4="http://schemas.microsoft.com/office/drawing/2016/5/10/chartex" xmlns:cx5="http://schemas.microsoft.com/office/drawing/2016/5/11/chartex" xmlns:cx6="http://schemas.microsoft.com/office/drawing/2016/5/12/chartex" xmlns:cx7="http://schemas.microsoft.com/office/drawing/2016/5/13/chartex" xmlns:cx8="http://schemas.microsoft.com/office/drawing/2016/5/14/chartex" xmlns:mc="http://schemas.openxmlformats.org/markup-compatibility/2006" xmlns:aink="http://schemas.microsoft.com/office/drawing/2016/ink" xmlns:am3d="http://schemas.microsoft.com/office/drawing/2017/model3d" xmlns:o="urn:schemas-microsoft-com:office:office" xmlns:oel="http://schemas.microsoft.com/office/2019/extlst" xmlns:r="http://schemas.openxmlformats.org/officeDocument/2006/relationships" xmlns:m="http://schemas.openxmlformats.org/officeDocument/2006/math" xmlns:v="urn:schemas-microsoft-com:vml" xmlns:wp14="http://schemas.microsoft.com/office/word/2010/wordprocessingDrawing" xmlns:wp="http://schemas.openxmlformats.org/drawingml/2006/wordprocessingDrawing" xmlns:w10="urn:schemas-microsoft-com:office:word" xmlns:w="http://schemas.openxmlformats.org/wordprocessingml/2006/main" xmlns:w14="http://schemas.microsoft.com/office/word/2010/wordml" xmlns:w15="http://schemas.microsoft.com/office/word/2012/wordml" xmlns:w16cex="http://schemas.microsoft.com/office/word/2018/wordml/cex" xmlns:w16cid="http://schemas.microsoft.com/office/word/2016/wordml/cid" xmlns:w16="http://schemas.microsoft.com/office/word/2018/wordml" xmlns:w16sdtdh="http://schemas.microsoft.com/office/word/2020/wordml/sdtdatahash" xmlns:w16se="http://schemas.microsoft.com/office/word/2015/wordml/symex" xmlns:wpg="http://schemas.microsoft.com/office/word/2010/wordprocessingGroup" xmlns:wpi="http://schemas.microsoft.com/office/word/2010/wordprocessingInk" xmlns:wne="http://schemas.microsoft.com/office/word/2006/wordml" xmlns:wps="http://schemas.microsoft.com/office/word/2010/wordprocessingShape" mc:Ignorable="w14 w15 w16se w16cid w16 w16cex w16sdtdh wp14">
-  <w:body>
-    <w:p>
-      <w:pPr>
-        <w:pageBreakBefore/>
-        <w:jc w:val="center"/>
-        <w:rPr>
-          <w:b/>
-          <w:bCs/>
-        </w:rPr>
-      </w:pPr>
-      <w:r>
-        <w:rPr>
-          <w:b/>
-          <w:bCs/>
-        </w:rPr>
-        <w:t>MINH CHỨNG PHỤ LỤC</w:t>
-      </w:r>
-    </w:p>
-    <w:p>
-      <w:pPr>
-        <w:spacing w:before="120" w:after="120"/>
-      </w:pPr>
-      <w:r>
-        <w:t>[NOI_DUNG_</w:t>
-      </w:r>
-      <w:r>
-        <w:t>PHU_LUC</w:t>
-      </w:r>
-      <w:r>
-        <w:t>]</w:t>
-      </w:r>
-    </w:p>
-    <w:sectPr>
-      <w:headerReference w:type="even" r:id="rId7"/>
-      <w:headerReference w:type="default" r:id="rId8"/>
-      <w:footerReference w:type="even" r:id="rId9"/>
-      <w:footerReference w:type="default" r:id="rId10"/>
-      <w:headerReference w:type="first" r:id="rId11"/>
-      <w:footerReference w:type="first" r:id="rId12"/>
-      <w:pgSz w:w="11906" w:h="16838"/>
-      <w:pgMar w:top="1134" w:right="1134" w:bottom="1134" w:left="1701" w:header="708" w:footer="708" w:gutter="0"/>
-      <w:pgNumType w:start="1"/>
-      <w:cols w:space="720"/>
-      <w:docGrid w:linePitch="360"/>
-    </w:sectPr>
-  </w:body>
-</w:document>
+<file path=word/document.xml><?xml version="1.0" encoding="UTF-8" standalone="yes"?>
+<w:document xmlns:wpc="http://schemas.microsoft.com/office/word/2010/wordprocessingCanvas" xmlns:cx="http://schemas.microsoft.com/office/drawing/2014/chartex" xmlns:cx1="http://schemas.microsoft.com/office/drawing/2015/9/8/chartex" xmlns:cx2="http://schemas.microsoft.com/office/drawing/2015/10/21/chartex" xmlns:cx3="http://schemas.microsoft.com/office/drawing/2016/5/9/chartex" xmlns:cx4="http://schemas.microsoft.com/office/drawing/2016/5/10/chartex" xmlns:cx5="http://schemas.microsoft.com/office/drawing/2016/5/11/chartex" xmlns:cx6="http://schemas.microsoft.com/office/drawing/2016/5/12/chartex" xmlns:cx7="http://schemas.microsoft.com/office/drawing/2016/5/13/chartex" xmlns:cx8="http://schemas.microsoft.com/office/drawing/2016/5/14/chartex" xmlns:mc="http://schemas.openxmlformats.org/markup-compatibility/2006" xmlns:aink="http://schemas.microsoft.com/office/drawing/2016/ink" xmlns:am3d="http://schemas.microsoft.com/office/drawing/2017/model3d" xmlns:o="urn:schemas-microsoft-com:office:office" xmlns:oel="http://schemas.microsoft.com/office/2019/extlst" xmlns:r="http://schemas.openxmlformats.org/officeDocument/2006/relationships" xmlns:m="http://schemas.openxmlformats.org/officeDocument/2006/math" xmlns:v="urn:schemas-microsoft-com:vml" xmlns:wp14="http://schemas.microsoft.com/office/word/2010/wordprocessingDrawing" xmlns:wp="http://schemas.openxmlformats.org/drawingml/2006/wordprocessingDrawing" xmlns:w10="urn:schemas-microsoft-com:office:word" xmlns:w="http://schemas.openxmlformats.org/wordprocessingml/2006/main" xmlns:w14="http://schemas.microsoft.com/office/word/2010/wordml" xmlns:w15="http://schemas.microsoft.com/office/word/2012/wordml" xmlns:w16cex="http://schemas.microsoft.com/office/word/2018/wordml/cex" xmlns:w16cid="http://schemas.microsoft.com/office/word/2016/wordml/cid" xmlns:w16="http://schemas.microsoft.com/office/word/2018/wordml" xmlns:w16sdtdh="http://schemas.microsoft.com/office/word/2020/wordml/sdtdatahash" xmlns:w16se="http://schemas.microsoft.com/office/word/2015/wordml/symex" xmlns:wpg="http://schemas.microsoft.com/office/word/2010/wordprocessingGroup" xmlns:wpi="http://schemas.microsoft.com/office/word/2010/wordprocessingInk" xmlns:wne="http://schemas.microsoft.com/office/word/2006/wordml" xmlns:wps="http://schemas.microsoft.com/office/word/2010/wordprocessingShape" mc:Ignorable="w14 w15 w16se w16cid w16 w16cex w16sdtdh wp14"><w:body><w:p><w:pPr><w:jc w:val="center"/></w:pPr><w:r><w:drawing><wp:inline cx="1524000" cy="1524000"><wp:extent cx="1524000" cy="1524000"/><wp:docPr id="999" name="QR"/><a:graphic xmlns:a="http://schemas.openxmlformats.org/drawingml/2006/main"><a:graphicData uri="http://schemas.openxmlformats.org/drawingml/2006/picture"><pic:pic xmlns:pic="http://schemas.openxmlformats.org/drawingml/2006/picture"><pic:nvPicPr><pic:cNvPr id="0" name="qr.png"/><pic:cNvPicPr/></pic:nvPicPr><pic:blipFill><a:blip xmlns:r="http://schemas.openxmlformats.org/officeDocument/2006/relationships" r:embed="rId999"/></a:blipFill><pic:spPr><a:xfrm><a:off x="0" y="0"/><a:ext cx="1524000" cy="1524000"/></a:xfrm><a:prstGeom prst="rect"><a:avLst/></a:prstGeom></pic:spPr></pic:pic></a:graphicData></a:graphic></wp:inline></w:drawing></w:r></w:p><w:p>
+<w:pPr>
+<w:pStyle w:val="Heading1"/>
+<w:jc w:val="left"/>
+<w:spacing w:before="240" w:after="120" w:line="360" w:lineRule="auto"/>
+</w:pPr>
+<w:r><w:t xml:space="preserve">PHỤ LỤC: DANH MỤC HÌNH ẢNH MINH CHỨNG</w:t></w:r>
+</w:p><w:p><w:pPr><w:jc w:val="center"/></w:pPr><w:r><w:drawing><wp:inline distT="0" distB="0" distL="0" distR="0"><wp:extent cx="3000000" cy="3000000"/><wp:docPr id="1" name="Image_1"/><wp:cNvGraphicFramePr><a:graphicFrameLocks xmlns:a="http://schemas.openxmlformats.org/drawingml/2006/main" noChangeAspect="1"/></wp:cNvGraphicFramePr><a:graphic xmlns:a="http://schemas.openxmlformats.org/drawingml/2006/main"><a:graphicData uri="http://schemas.openxmlformats.org/drawingml/2006/picture"><pic:pic xmlns:pic="http://schemas.openxmlformats.org/drawingml/2006/picture"><pic:nvPicPr><pic:cNvPr id="1" name="Image_1"/><pic:cNvPicPr/></pic:nvPicPr><pic:blipFill><a:blip xmlns:r="http://schemas.openxmlformats.org/officeDocument/2006/relationships" r:embed="rId_IMG_CBBV6WS"/><a:stretch><a:fillRect/></a:stretch></pic:blipFill><pic:spPr><a:xfrm><a:off x="0" y="0"/><a:ext cx="3000000" cy="3000000"/></a:xfrm><a:prstGeom prst="rect"><a:avLst/></a:prstGeom></pic:spPr></pic:pic></a:graphicData></a:graphic></wp:inline></w:drawing></w:r></w:p><w:p>
+<w:pPr>
+<w:jc w:val="both"/>
+<w:ind w:firstLine="720"/>
+<w:spacing w:line="360" w:lineRule="auto" w:after="120"/>
+</w:pPr>
+<w:r><w:rPr><w:b/><w:i/></w:rPr><w:t xml:space="preserve">Hình 1</w:t></w:r><w:r><w:rPr><w:i/></w:rPr><w:t xml:space="preserve">: Hình 1. Tôi tổ chức bài kiểm tra khảo sát năng lực tưởng tượng không gian và kiến thức nền tảng về hình học không gian cho học sinh trước khi áp dụng giải pháp.</w:t></w:r>
+</w:p><w:p><w:pPr><w:jc w:val="center"/></w:pPr><w:r><w:drawing><wp:inline distT="0" distB="0" distL="0" distR="0"><wp:extent cx="3000000" cy="3000000"/><wp:docPr id="2" name="Image_2"/><wp:cNvGraphicFramePr><a:graphicFrameLocks xmlns:a="http://schemas.openxmlformats.org/drawingml/2006/main" noChangeAspect="1"/></wp:cNvGraphicFramePr><a:graphic xmlns:a="http://schemas.openxmlformats.org/drawingml/2006/main"><a:graphicData uri="http://schemas.openxmlformats.org/drawingml/2006/picture"><pic:pic xmlns:pic="http://schemas.openxmlformats.org/drawingml/2006/picture"><pic:nvPicPr><pic:cNvPr id="2" name="Image_2"/><pic:cNvPicPr/></pic:nvPicPr><pic:blipFill><a:blip xmlns:r="http://schemas.openxmlformats.org/officeDocument/2006/relationships" r:embed="rId_IMG_CWJMSYP"/><a:stretch><a:fillRect/></a:stretch></pic:blipFill><pic:spPr><a:xfrm><a:off x="0" y="0"/><a:ext cx="3000000" cy="3000000"/></a:xfrm><a:prstGeom prst="rect"><a:avLst/></a:prstGeom></pic:spPr></pic:pic></a:graphicData></a:graphic></wp:inline></w:drawing></w:r></w:p><w:p>
+<w:pPr>
+<w:jc w:val="both"/>
+<w:ind w:firstLine="720"/>
+<w:spacing w:line="360" w:lineRule="auto" w:after="120"/>
+</w:pPr>
+<w:r><w:rPr><w:b/><w:i/></w:rPr><w:t xml:space="preserve">Hình 2</w:t></w:r><w:r><w:rPr><w:i/></w:rPr><w:t xml:space="preserve">: Hình 2. Tôi xây dựng các mô hình 3D trực quan, tương tác cho các khái niệm hình học không gian bằng phần mềm chuyên dụng để phục vụ bài giảng.</w:t></w:r>
+</w:p><w:p><w:pPr><w:jc w:val="center"/></w:pPr><w:r><w:drawing><wp:inline distT="0" distB="0" distL="0" distR="0"><wp:extent cx="3000000" cy="3000000"/><wp:docPr id="3" name="Image_3"/><wp:cNvGraphicFramePr><a:graphicFrameLocks xmlns:a="http://schemas.openxmlformats.org/drawingml/2006/main" noChangeAspect="1"/></wp:cNvGraphicFramePr><a:graphic xmlns:a="http://schemas.openxmlformats.org/drawingml/2006/main"><a:graphicData uri="http://schemas.openxmlformats.org/drawingml/2006/picture"><pic:pic xmlns:pic="http://schemas.openxmlformats.org/drawingml/2006/picture"><pic:nvPicPr><pic:cNvPr id="3" name="Image_3"/><pic:cNvPicPr/></pic:nvPicPr><pic:blipFill><a:blip xmlns:r="http://schemas.openxmlformats.org/officeDocument/2006/relationships" r:embed="rId_IMG_5CWT3VU"/><a:stretch><a:fillRect/></a:stretch></pic:blipFill><pic:spPr><a:xfrm><a:off x="0" y="0"/><a:ext cx="3000000" cy="3000000"/></a:xfrm><a:prstGeom prst="rect"><a:avLst/></a:prstGeom></pic:spPr></pic:pic></a:graphicData></a:graphic></wp:inline></w:drawing></w:r></w:p><w:p>
+<w:pPr>
+<w:jc w:val="both"/>
+<w:ind w:firstLine="720"/>
+<w:spacing w:line="360" w:lineRule="auto" w:after="120"/>
+</w:pPr>
+<w:r><w:rPr><w:b/><w:i/></w:rPr><w:t xml:space="preserve">Hình 3</w:t></w:r><w:r><w:rPr><w:i/></w:rPr><w:t xml:space="preserve">: Hình 3. Tôi thiết kế phiếu bài tập yêu cầu học sinh tương tác trực tiếp với mô hình 3D để khám phá và giải quyết các bài toán hình học không gian.</w:t></w:r>
+</w:p><w:p><w:pPr><w:jc w:val="center"/></w:pPr><w:r><w:drawing><wp:inline distT="0" distB="0" distL="0" distR="0"><wp:extent cx="3000000" cy="3000000"/><wp:docPr id="4" name="Image_4"/><wp:cNvGraphicFramePr><a:graphicFrameLocks xmlns:a="http://schemas.openxmlformats.org/drawingml/2006/main" noChangeAspect="1"/></wp:cNvGraphicFramePr><a:graphic xmlns:a="http://schemas.openxmlformats.org/drawingml/2006/main"><a:graphicData uri="http://schemas.openxmlformats.org/drawingml/2006/picture"><pic:pic xmlns:pic="http://schemas.openxmlformats.org/drawingml/2006/picture"><pic:nvPicPr><pic:cNvPr id="4" name="Image_4"/><pic:cNvPicPr/></pic:nvPicPr><pic:blipFill><a:blip xmlns:r="http://schemas.openxmlformats.org/officeDocument/2006/relationships" r:embed="rId_IMG_4KTY086"/><a:stretch><a:fillRect/></a:stretch></pic:blipFill><pic:spPr><a:xfrm><a:off x="0" y="0"/><a:ext cx="3000000" cy="3000000"/></a:xfrm><a:prstGeom prst="rect"><a:avLst/></a:prstGeom></pic:spPr></pic:pic></a:graphicData></a:graphic></wp:inline></w:drawing></w:r></w:p><w:p>
+<w:pPr>
+<w:jc w:val="both"/>
+<w:ind w:firstLine="720"/>
+<w:spacing w:line="360" w:lineRule="auto" w:after="120"/>
+</w:pPr>
+<w:r><w:rPr><w:b/><w:i/></w:rPr><w:t xml:space="preserve">Hình 4</w:t></w:r><w:r><w:rPr><w:i/></w:rPr><w:t xml:space="preserve">: Hình 4. Tôi sử dụng mô hình 3D tương tác trên bảng chiếu để minh họa các khái niệm trừu tượng, giúp học sinh dễ hình dung và nắm bắt bài học.</w:t></w:r>
+</w:p><w:p><w:pPr><w:jc w:val="center"/></w:pPr><w:r><w:drawing><wp:inline distT="0" distB="0" distL="0" distR="0"><wp:extent cx="3000000" cy="3000000"/><wp:docPr id="5" name="Image_5"/><wp:cNvGraphicFramePr><a:graphicFrameLocks xmlns:a="http://schemas.openxmlformats.org/drawingml/2006/main" noChangeAspect="1"/></wp:cNvGraphicFramePr><a:graphic xmlns:a="http://schemas.openxmlformats.org/drawingml/2006/main"><a:graphicData uri="http://schemas.openxmlformats.org/drawingml/2006/picture"><pic:pic xmlns:pic="http://schemas.openxmlformats.org/drawingml/2006/picture"><pic:nvPicPr><pic:cNvPr id="5" name="Image_5"/><pic:cNvPicPr/></pic:nvPicPr><pic:blipFill><a:blip xmlns:r="http://schemas.openxmlformats.org/officeDocument/2006/relationships" r:embed="rId_IMG_1NCVSTW"/><a:stretch><a:fillRect/></a:stretch></pic:blipFill><pic:spPr><a:xfrm><a:off x="0" y="0"/><a:ext cx="3000000" cy="3000000"/></a:xfrm><a:prstGeom prst="rect"><a:avLst/></a:prstGeom></pic:spPr></pic:pic></a:graphicData></a:graphic></wp:inline></w:drawing></w:r></w:p><w:p>
+<w:pPr>
+<w:jc w:val="both"/>
+<w:ind w:firstLine="720"/>
+<w:spacing w:line="360" w:lineRule="auto" w:after="120"/>
+</w:pPr>
+<w:r><w:rPr><w:b/><w:i/></w:rPr><w:t xml:space="preserve">Hình 5</w:t></w:r><w:r><w:rPr><w:i/></w:rPr><w:t xml:space="preserve">: Hình 5. Học sinh chủ động thực hành trên máy tính, tự tay thao tác với các mô hình 3D để khám phá tính chất và giải quyết bài toán.</w:t></w:r>
+</w:p><w:p><w:pPr><w:jc w:val="center"/></w:pPr><w:r><w:drawing><wp:inline distT="0" distB="0" distL="0" distR="0"><wp:extent cx="3000000" cy="3000000"/><wp:docPr id="6" name="Image_6"/><wp:cNvGraphicFramePr><a:graphicFrameLocks xmlns:a="http://schemas.openxmlformats.org/drawingml/2006/main" noChangeAspect="1"/></wp:cNvGraphicFramePr><a:graphic xmlns:a="http://schemas.openxmlformats.org/drawingml/2006/main"><a:graphicData uri="http://schemas.openxmlformats.org/drawingml/2006/picture"><pic:pic xmlns:pic="http://schemas.openxmlformats.org/drawingml/2006/picture"><pic:nvPicPr><pic:cNvPr id="6" name="Image_6"/><pic:cNvPicPr/></pic:nvPicPr><pic:blipFill><a:blip xmlns:r="http://schemas.openxmlformats.org/officeDocument/2006/relationships" r:embed="rId_IMG_NT8Z0DZ"/><a:stretch><a:fillRect/></a:stretch></pic:blipFill><pic:spPr><a:xfrm><a:off x="0" y="0"/><a:ext cx="3000000" cy="3000000"/></a:xfrm><a:prstGeom prst="rect"><a:avLst/></a:prstGeom></pic:spPr></pic:pic></a:graphicData></a:graphic></wp:inline></w:drawing></w:r></w:p><w:p>
+<w:pPr>
+<w:jc w:val="both"/>
+<w:ind w:firstLine="720"/>
+<w:spacing w:line="360" w:lineRule="auto" w:after="120"/>
+</w:pPr>
+<w:r><w:rPr><w:b/><w:i/></w:rPr><w:t xml:space="preserve">Hình 6</w:t></w:r><w:r><w:rPr><w:i/></w:rPr><w:t xml:space="preserve">: Hình 6. Học sinh làm việc nhóm và thuyết trình về dự án xây dựng mô hình 3D cho một bài toán cụ thể, rèn luyện kỹ năng tư duy và trình bày.</w:t></w:r>
+</w:p><w:p><w:pPr><w:jc w:val="center"/></w:pPr><w:r><w:drawing><wp:inline distT="0" distB="0" distL="0" distR="0"><wp:extent cx="3000000" cy="3000000"/><wp:docPr id="7" name="Image_7"/><wp:cNvGraphicFramePr><a:graphicFrameLocks xmlns:a="http://schemas.openxmlformats.org/drawingml/2006/main" noChangeAspect="1"/></wp:cNvGraphicFramePr><a:graphic xmlns:a="http://schemas.openxmlformats.org/drawingml/2006/main"><a:graphicData uri="http://schemas.openxmlformats.org/drawingml/2006/picture"><pic:pic xmlns:pic="http://schemas.openxmlformats.org/drawingml/2006/picture"><pic:nvPicPr><pic:cNvPr id="7" name="Image_7"/><pic:cNvPicPr/></pic:nvPicPr><pic:blipFill><a:blip xmlns:r="http://schemas.openxmlformats.org/officeDocument/2006/relationships" r:embed="rId_IMG_I5DPADC"/><a:stretch><a:fillRect/></a:stretch></pic:blipFill><pic:spPr><a:xfrm><a:off x="0" y="0"/><a:ext cx="3000000" cy="3000000"/></a:xfrm><a:prstGeom prst="rect"><a:avLst/></a:prstGeom></pic:spPr></pic:pic></a:graphicData></a:graphic></wp:inline></w:drawing></w:r></w:p><w:p>
+<w:pPr>
+<w:jc w:val="both"/>
+<w:ind w:firstLine="720"/>
+<w:spacing w:line="360" w:lineRule="auto" w:after="120"/>
+</w:pPr>
+<w:r><w:rPr><w:b/><w:i/></w:rPr><w:t xml:space="preserve">Hình 7</w:t></w:r><w:r><w:rPr><w:i/></w:rPr><w:t xml:space="preserve">: Hình 7. Biểu đồ so sánh kết quả bài kiểm tra năng lực tưởng tượng không gian và kiến thức hình học không gian của học sinh trước và sau khi áp dụng giải pháp.</w:t></w:r>
+</w:p><w:sectPr><w:headerReference w:type="even" r:id="rId7"/><w:headerReference w:type="default" r:id="rId8"/><w:footerReference w:type="even" r:id="rId9"/><w:footerReference w:type="default" r:id="rId10"/><w:headerReference w:type="first" r:id="rId11"/><w:footerReference w:type="first" r:id="rId12"/><w:pgSz w:w="11906" w:h="16838"/><w:pgMar w:top="1134" w:right="1134" w:bottom="1134" w:left="1701" w:header="708" w:footer="708" w:gutter="0"/><w:pgNumType w:start="1"/><w:cols w:space="720"/><w:docGrid w:linePitch="360"/></w:sectPr></w:body></w:document>
 </file>
 
 <file path=word/endnotes.xml><?xml version="1.0" encoding="utf-8"?>

</xml_diff>